<commit_message>
Update Horse Gait Lab materials for the revised app
- Worksheet Part C is now Construct the Bound: students build the one gait
  the app does not ship (RH 0, LF 0.50, RF 0.50; two beats; suspension below
  duty 0.50), then compare with Trot and Pace - three ways to pair four legs
- Answer key and teacher guide updated to match (bound targets, thresholds,
  three-pairings punchline, new sticking points, Hoofbeats/scatter/sync notes)
- Gait table and slides updated: Canter replaces Bound to match the app;
  slide 8 teaches the canter with the Waugsberg cantering animation
  (Wikimedia Commons, CC BY 2.5, credited on the slide)
- Headers and framing credit Tucson High School students (first run)
- Add repository README describing the labs and linking the live web app

Co-Authored-By: Claude Fable 5 <noreply@anthropic.com>
</commit_message>
<xml_diff>
--- a/labs/Outreach-HorseGaits/Horse_Gait_Lab_Answer_Key.docx
+++ b/labs/Outreach-HorseGaits/Horse_Gait_Lab_Answer_Key.docx
@@ -49,7 +49,7 @@
                 <w:sz w:val="18"/>
                 <w:szCs w:val="18"/>
               </w:rPr>
-              <w:t xml:space="preserve">SONIA KOVALEVSKY DAY · 2026  ·  TEACHER COPY</w:t>
+              <w:t xml:space="preserve">TUCSON HIGH SCHOOL · 2026  ·  TEACHER COPY</w:t>
             </w:r>
           </w:p>
           <w:p>
@@ -770,7 +770,7 @@
                 <w:sz w:val="20"/>
                 <w:szCs w:val="20"/>
               </w:rPr>
-              <w:t xml:space="preserve">Bound</w:t>
+              <w:t xml:space="preserve">Canter</w:t>
             </w:r>
           </w:p>
         </w:tc>
@@ -803,7 +803,7 @@
                 <w:sz w:val="19"/>
                 <w:szCs w:val="19"/>
               </w:rPr>
-              <w:t xml:space="preserve">2</w:t>
+              <w:t xml:space="preserve">3</w:t>
             </w:r>
           </w:p>
         </w:tc>
@@ -836,7 +836,7 @@
                 <w:sz w:val="19"/>
                 <w:szCs w:val="19"/>
               </w:rPr>
-              <w:t xml:space="preserve">Both front feet land, then both back feet. Up-and-down rocking, used by rabbits and some small mammals.</w:t>
+              <w:t xml:space="preserve">Right-lead order: LH first, then RH+LF together as a diagonal pair, then RF. After the RF beat all four feet leave the ground — a moment of suspension.</w:t>
             </w:r>
           </w:p>
         </w:tc>
@@ -1479,7 +1479,7 @@
           <w:sz w:val="18"/>
           <w:szCs w:val="18"/>
         </w:rPr>
-        <w:t xml:space="preserve">PART C — BUILD A CANTER, THEN INVENT YOUR OWN</w:t>
+        <w:t xml:space="preserve">PART C — CONSTRUCT THE BOUND, THEN INVENT YOUR OWN</w:t>
       </w:r>
     </w:p>
     <w:p>
@@ -1495,7 +1495,7 @@
           <w:sz w:val="20"/>
           <w:szCs w:val="20"/>
         </w:rPr>
-        <w:t xml:space="preserve">Canter phases (right-lead):  </w:t>
+        <w:t xml:space="preserve">(a) Which legs must land together?  </w:t>
       </w:r>
       <w:r>
         <w:rPr>
@@ -1506,8 +1506,13 @@
           <w:sz w:val="20"/>
           <w:szCs w:val="20"/>
         </w:rPr>
-        <w:t xml:space="preserve">LH = 0, RH = 0.25, LF = 0.25, RF = 0.50.  </w:t>
-      </w:r>
+        <w:t xml:space="preserve">the two hinds land together and the two fronts land together. RH must equal LH's 0, and LF must equal RF.</w:t>
+      </w:r>
+    </w:p>
+    <w:p>
+      <w:pPr>
+        <w:spacing w:after="60" w:line="280"/>
+      </w:pPr>
       <w:r>
         <w:rPr>
           <w:rFonts w:ascii="Calibri" w:cs="Calibri" w:eastAsia="Calibri" w:hAnsi="Calibri"/>
@@ -1517,7 +1522,7 @@
           <w:sz w:val="20"/>
           <w:szCs w:val="20"/>
         </w:rPr>
-        <w:t xml:space="preserve">Duty for a visible end-of-stride suspension:  </w:t>
+        <w:t xml:space="preserve">(b) The three offsets:  </w:t>
       </w:r>
       <w:r>
         <w:rPr>
@@ -1528,7 +1533,88 @@
           <w:sz w:val="20"/>
           <w:szCs w:val="20"/>
         </w:rPr>
-        <w:t xml:space="preserve">about 0.30 – 0.35. The last beat (RF) lands at 0.50 and lifts by ≈0.85, leaving an airborne gap before the next LH beat at 1.0.</w:t>
+        <w:t xml:space="preserve">RH = 0.00, LF = 0.50, RF = 0.50 (LH is the reference at 0).</w:t>
+      </w:r>
+    </w:p>
+    <w:p>
+      <w:pPr>
+        <w:spacing w:after="60" w:line="280"/>
+      </w:pPr>
+      <w:r>
+        <w:rPr>
+          <w:rFonts w:ascii="Calibri" w:cs="Calibri" w:eastAsia="Calibri" w:hAnsi="Calibri"/>
+          <w:b/>
+          <w:bCs/>
+          <w:color w:val="6B5B4A"/>
+          <w:sz w:val="20"/>
+          <w:szCs w:val="20"/>
+        </w:rPr>
+        <w:t xml:space="preserve">(c) Beats per stride:  </w:t>
+      </w:r>
+      <w:r>
+        <w:rPr>
+          <w:rFonts w:ascii="Calibri" w:cs="Calibri" w:eastAsia="Calibri" w:hAnsi="Calibri"/>
+          <w:i/>
+          <w:iCs/>
+          <w:color w:val="1F5E3A"/>
+          <w:sz w:val="20"/>
+          <w:szCs w:val="20"/>
+        </w:rPr>
+        <w:t xml:space="preserve">Two — the hinds land as one beat, the fronts as the other.</w:t>
+      </w:r>
+    </w:p>
+    <w:p>
+      <w:pPr>
+        <w:spacing w:after="60" w:line="280"/>
+      </w:pPr>
+      <w:r>
+        <w:rPr>
+          <w:rFonts w:ascii="Calibri" w:cs="Calibri" w:eastAsia="Calibri" w:hAnsi="Calibri"/>
+          <w:b/>
+          <w:bCs/>
+          <w:color w:val="6B5B4A"/>
+          <w:sz w:val="20"/>
+          <w:szCs w:val="20"/>
+        </w:rPr>
+        <w:t xml:space="preserve">(d) Suspension threshold:  </w:t>
+      </w:r>
+      <w:r>
+        <w:rPr>
+          <w:rFonts w:ascii="Calibri" w:cs="Calibri" w:eastAsia="Calibri" w:hAnsi="Calibri"/>
+          <w:i/>
+          <w:iCs/>
+          <w:color w:val="1F5E3A"/>
+          <w:sz w:val="20"/>
+          <w:szCs w:val="20"/>
+        </w:rPr>
+        <w:t xml:space="preserve">duty &lt; 0.50. The hinds are on the ground for [0, duty] and the fronts for [0.50, 0.50 + duty], so there are two airborne windows per stride — (duty, 0.50) and (0.50 + duty, 1.0) — and they exist only when duty &lt; 0.50.</w:t>
+      </w:r>
+    </w:p>
+    <w:p>
+      <w:pPr>
+        <w:spacing w:after="60" w:line="280"/>
+      </w:pPr>
+      <w:r>
+        <w:rPr>
+          <w:rFonts w:ascii="Calibri" w:cs="Calibri" w:eastAsia="Calibri" w:hAnsi="Calibri"/>
+          <w:b/>
+          <w:bCs/>
+          <w:color w:val="6B5B4A"/>
+          <w:sz w:val="20"/>
+          <w:szCs w:val="20"/>
+        </w:rPr>
+        <w:t xml:space="preserve">(e) Comparing with Trot and Pace:  </w:t>
+      </w:r>
+      <w:r>
+        <w:rPr>
+          <w:rFonts w:ascii="Calibri" w:cs="Calibri" w:eastAsia="Calibri" w:hAnsi="Calibri"/>
+          <w:i/>
+          <w:iCs/>
+          <w:color w:val="1F5E3A"/>
+          <w:sz w:val="20"/>
+          <w:szCs w:val="20"/>
+        </w:rPr>
+        <w:t xml:space="preserve">all three are two-beat pair gaits — only the pairing differs. Trot pairs the diagonals, pace pairs the same sides, bound pairs front and hind.</w:t>
       </w:r>
     </w:p>
     <w:p>
@@ -1542,7 +1628,7 @@
           <w:sz w:val="22"/>
           <w:szCs w:val="22"/>
         </w:rPr>
-        <w:t xml:space="preserve">Students should notice: the diagonal pair (RH and LF) lands together as the middle beat, and the suspension appears at the end of the stride (between RF and the next LH). If they set LF ≠ RH they will hear a 4-beat gait instead — also fine for discussion.</w:t>
+        <w:t xml:space="preserve">Students should notice: the two pairs take turns, and once duty drops below 0.50 the horse is airborne twice per stride — between the hinds lifting and the fronts landing, and again at the end of the stride. If a pair is not set exactly equal they will hear a 4-beat gait instead — also fine for discussion.</w:t>
       </w:r>
     </w:p>
     <w:p>

</xml_diff>